<commit_message>
fix(submit): 公开仓库对齐 2026-10-21 终稿口径（141 passed，去掉 stub）
评委可见口径对齐：141 passed、确认门不再写 stub；zip 约 294KB/108 文件。Mac 终包 298KB/109 若需逐字节一致仍跑 push_repo_sync.sh。
</commit_message>
<xml_diff>
--- a/submit/04_安全自评报告_v1.docx
+++ b/submit/04_安全自评报告_v1.docx
@@ -345,7 +345,7 @@
                 <w:b w:val="0"/>
                 <w:sz w:val="19"/>
               </w:rPr>
-              <w:t>达标（W0）/ 推进中（W1）</w:t>
+              <w:t>达标</w:t>
             </w:r>
           </w:p>
         </w:tc>
@@ -361,7 +361,7 @@
                 <w:b w:val="0"/>
                 <w:sz w:val="19"/>
               </w:rPr>
-              <w:t>转账≥5k 待确认；订阅写操作 PendingAction stub</w:t>
+              <w:t>转账≥5k 未确认不落账；订阅写经 PendingAction，确认后才改 Mock Bank</w:t>
             </w:r>
           </w:p>
         </w:tc>
@@ -1923,7 +1923,7 @@
           <w:b w:val="0"/>
           <w:sz w:val="21"/>
         </w:rPr>
-        <w:t>本轮已落：类型 + 内存 stub（create/confirm/cancel）；确认前零银行写。</w:t>
+        <w:t>已实现 create/confirm/cancel：未确认零写入；用户确认且未过期后才写入 Mock Bank。</w:t>
       </w:r>
     </w:p>
     <w:p>

</xml_diff>